<commit_message>
Erste Stadt eingefügt, Mehr inhalt erforderlich
Signed-off-by: Meikono <c.eppers122@googlemail.com>
</commit_message>
<xml_diff>
--- a/resources/lore deutsch/Shorin (Spoiler).docx
+++ b/resources/lore deutsch/Shorin (Spoiler).docx
@@ -5035,7 +5035,21 @@
         <w:rPr>
           <w:rFonts w:ascii="Lucida Calligraphy" w:hAnsi="Lucida Calligraphy"/>
         </w:rPr>
-        <w:t xml:space="preserve"> Dwellers, über die nicht viel bekannt ist, da alle Aufzeichnungen zerstört wurden und niemand die Ruinen erkunden kann. </w:t>
+        <w:t xml:space="preserve"> </w:t>
+      </w:r>
+      <w:proofErr w:type="spellStart"/>
+      <w:r>
+        <w:rPr>
+          <w:rFonts w:ascii="Lucida Calligraphy" w:hAnsi="Lucida Calligraphy"/>
+        </w:rPr>
+        <w:t>Dwellers</w:t>
+      </w:r>
+      <w:proofErr w:type="spellEnd"/>
+      <w:r>
+        <w:rPr>
+          <w:rFonts w:ascii="Lucida Calligraphy" w:hAnsi="Lucida Calligraphy"/>
+        </w:rPr>
+        <w:t xml:space="preserve">, über die nicht viel bekannt ist, da alle Aufzeichnungen zerstört wurden und niemand die Ruinen erkunden kann. </w:t>
       </w:r>
     </w:p>
     <w:p>
@@ -9736,6 +9750,13 @@
     </w:p>
     <w:p>
       <w:pPr>
+        <w:rPr>
+          <w:rFonts w:ascii="Lucida Calligraphy" w:eastAsia="Malgun Gothic" w:hAnsi="Lucida Calligraphy"/>
+        </w:rPr>
+      </w:pPr>
+    </w:p>
+    <w:p>
+      <w:pPr>
         <w:pStyle w:val="berschrift1"/>
         <w:rPr>
           <w:rFonts w:ascii="Lucida Calligraphy" w:eastAsia="Malgun Gothic" w:hAnsi="Lucida Calligraphy"/>
@@ -9745,6 +9766,7 @@
         <w:rPr>
           <w:rFonts w:ascii="Lucida Calligraphy" w:eastAsia="Malgun Gothic" w:hAnsi="Lucida Calligraphy"/>
         </w:rPr>
+        <w:lastRenderedPageBreak/>
         <w:t xml:space="preserve">Orte: </w:t>
       </w:r>
     </w:p>
@@ -9762,6 +9784,7 @@
         <w:t>Östliche Orte:</w:t>
       </w:r>
     </w:p>
+    <w:p/>
     <w:p>
       <w:proofErr w:type="spellStart"/>
       <w:r>
@@ -9771,6 +9794,33 @@
       <w:r>
         <w:t>:</w:t>
       </w:r>
+      <w:r>
+        <w:t xml:space="preserve"> An diesen Ort ist die Revolution der </w:t>
+      </w:r>
+      <w:proofErr w:type="spellStart"/>
+      <w:r>
+        <w:t>Weres</w:t>
+      </w:r>
+      <w:proofErr w:type="spellEnd"/>
+      <w:r>
+        <w:t xml:space="preserve"> ausgebrochen und nun die letzte Stadt die das </w:t>
+      </w:r>
+      <w:proofErr w:type="spellStart"/>
+      <w:r>
+        <w:t>Unbridled</w:t>
+      </w:r>
+      <w:proofErr w:type="spellEnd"/>
+      <w:r>
+        <w:t xml:space="preserve"> Land von </w:t>
+      </w:r>
+      <w:proofErr w:type="spellStart"/>
+      <w:r>
+        <w:t>Furwood</w:t>
+      </w:r>
+      <w:proofErr w:type="spellEnd"/>
+      <w:r>
+        <w:t xml:space="preserve"> trennt. </w:t>
+      </w:r>
     </w:p>
     <w:p/>
     <w:p>
@@ -9802,8 +9852,73 @@
       <w:r>
         <w:t>-Mill</w:t>
       </w:r>
+      <w:r>
+        <w:t xml:space="preserve">: Nördliche Menschenstadt, gelegen in einen Tief wo ein Fluss in einen See mündet. Das Wasser fließt von dort in ein unterirdisches System. Die Stadt ist sehr zentral zwischen den Feldern und </w:t>
+      </w:r>
+      <w:proofErr w:type="gramStart"/>
+      <w:r>
+        <w:t>das</w:t>
+      </w:r>
+      <w:proofErr w:type="gramEnd"/>
+      <w:r>
+        <w:t xml:space="preserve"> Weizen muss nur nach unten gefahren werden, wodurch die Farmer gerne dort verkaufen und viele Mühlen durch den Fluss angetrieben werden. </w:t>
+      </w:r>
     </w:p>
     <w:p/>
+    <w:p>
+      <w:proofErr w:type="spellStart"/>
+      <w:r>
+        <w:t>WhiteBridge</w:t>
+      </w:r>
+      <w:proofErr w:type="spellEnd"/>
+      <w:r>
+        <w:t xml:space="preserve">: Verbindungsstadt zwischen der Menschlichen Hauptstadt und den Dörfern und </w:t>
+      </w:r>
+      <w:proofErr w:type="spellStart"/>
+      <w:r>
+        <w:t>städten</w:t>
+      </w:r>
+      <w:proofErr w:type="spellEnd"/>
+      <w:r>
+        <w:t xml:space="preserve"> der Umgebung. Es gibt dort ein relativ starkes Militär und reisende übernachten dort </w:t>
+      </w:r>
+      <w:proofErr w:type="spellStart"/>
+      <w:r>
+        <w:t>befohr</w:t>
+      </w:r>
+      <w:proofErr w:type="spellEnd"/>
+      <w:r>
+        <w:t xml:space="preserve"> sie in die Stadt ziehen oder wenn sie von der Stadt wegreisen. </w:t>
+      </w:r>
+    </w:p>
+    <w:p>
+      <w:proofErr w:type="spellStart"/>
+      <w:r>
+        <w:t>Sudbury</w:t>
+      </w:r>
+      <w:proofErr w:type="spellEnd"/>
+      <w:r>
+        <w:t>:</w:t>
+      </w:r>
+    </w:p>
+    <w:p/>
+    <w:p>
+      <w:r>
+        <w:t>Personen:</w:t>
+      </w:r>
+      <w:r>
+        <w:br/>
+        <w:t>Dave (</w:t>
+      </w:r>
+      <w:proofErr w:type="spellStart"/>
+      <w:r>
+        <w:t>WhiteBridge</w:t>
+      </w:r>
+      <w:proofErr w:type="spellEnd"/>
+      <w:r>
+        <w:t>)</w:t>
+      </w:r>
+    </w:p>
     <w:sectPr>
       <w:pgSz w:w="11906" w:h="16838"/>
       <w:pgMar w:top="1417" w:right="1417" w:bottom="1134" w:left="1417" w:header="708" w:footer="708" w:gutter="0"/>
@@ -10583,7 +10698,7 @@
 </file>
 
 <file path=customXml/itemProps2.xml><?xml version="1.0" encoding="utf-8"?>
-<ds:datastoreItem xmlns:ds="http://schemas.openxmlformats.org/officeDocument/2006/customXml" ds:itemID="{399214B2-86FB-47CD-B9DB-2C83B78D3993}">
+<ds:datastoreItem xmlns:ds="http://schemas.openxmlformats.org/officeDocument/2006/customXml" ds:itemID="{C8023094-BC60-4DA5-9567-6703AC48B8BE}">
   <ds:schemaRefs>
     <ds:schemaRef ds:uri="http://schemas.openxmlformats.org/officeDocument/2006/bibliography"/>
   </ds:schemaRefs>

</xml_diff>